<commit_message>
docs: add weekly report 1 docs
</commit_message>
<xml_diff>
--- a/docs/weekly-reports/week-01/Week-01-Progress-Report.docx
+++ b/docs/weekly-reports/week-01/Week-01-Progress-Report.docx
@@ -5,7 +5,7 @@
     <w:p>
       <w:pPr>
         <w:pStyle w:val="Title"/>
-        <w:spacing w:line="360" w:lineRule="auto"/>
+        <w:spacing w:line="276" w:lineRule="auto"/>
         <w:ind w:left="720" w:firstLine="720"/>
         <w:rPr>
           <w:rFonts w:ascii="Times New Roman" w:hAnsi="Times New Roman" w:cs="Times New Roman"/>
@@ -47,7 +47,7 @@
     </w:p>
     <w:p>
       <w:pPr>
-        <w:spacing w:before="47" w:line="360" w:lineRule="auto"/>
+        <w:spacing w:before="47" w:line="276" w:lineRule="auto"/>
         <w:ind w:left="16" w:right="1"/>
         <w:jc w:val="center"/>
         <w:rPr>
@@ -137,7 +137,7 @@
     </w:p>
     <w:p>
       <w:pPr>
-        <w:spacing w:before="187" w:line="360" w:lineRule="auto"/>
+        <w:spacing w:before="187" w:line="276" w:lineRule="auto"/>
         <w:ind w:left="2957" w:firstLine="643"/>
         <w:rPr>
           <w:b/>
@@ -230,7 +230,7 @@
           <w:p>
             <w:pPr>
               <w:pStyle w:val="TableParagraph"/>
-              <w:spacing w:before="54" w:line="360" w:lineRule="auto"/>
+              <w:spacing w:before="54" w:line="276" w:lineRule="auto"/>
               <w:ind w:left="110"/>
               <w:rPr>
                 <w:b/>
@@ -255,7 +255,7 @@
           <w:p>
             <w:pPr>
               <w:pStyle w:val="TableParagraph"/>
-              <w:spacing w:before="54" w:line="360" w:lineRule="auto"/>
+              <w:spacing w:before="54" w:line="276" w:lineRule="auto"/>
               <w:ind w:left="110"/>
               <w:rPr>
                 <w:sz w:val="24"/>
@@ -294,7 +294,7 @@
           <w:p>
             <w:pPr>
               <w:pStyle w:val="TableParagraph"/>
-              <w:spacing w:before="54" w:line="360" w:lineRule="auto"/>
+              <w:spacing w:before="54" w:line="276" w:lineRule="auto"/>
               <w:ind w:left="109"/>
               <w:rPr>
                 <w:b/>
@@ -321,7 +321,7 @@
           <w:p>
             <w:pPr>
               <w:pStyle w:val="TableParagraph"/>
-              <w:spacing w:before="54" w:line="360" w:lineRule="auto"/>
+              <w:spacing w:before="54" w:line="276" w:lineRule="auto"/>
               <w:ind w:left="172"/>
               <w:rPr>
                 <w:sz w:val="24"/>
@@ -350,7 +350,7 @@
           <w:p>
             <w:pPr>
               <w:pStyle w:val="TableParagraph"/>
-              <w:spacing w:before="142" w:line="360" w:lineRule="auto"/>
+              <w:spacing w:before="142" w:line="276" w:lineRule="auto"/>
               <w:ind w:left="110"/>
               <w:rPr>
                 <w:b/>
@@ -377,7 +377,7 @@
           <w:p>
             <w:pPr>
               <w:pStyle w:val="TableParagraph"/>
-              <w:spacing w:before="256" w:line="360" w:lineRule="auto"/>
+              <w:spacing w:before="256" w:line="276" w:lineRule="auto"/>
               <w:ind w:left="172"/>
               <w:rPr>
                 <w:sz w:val="24"/>
@@ -400,7 +400,15 @@
                 <w:sz w:val="24"/>
                 <w:szCs w:val="24"/>
               </w:rPr>
-              <w:t xml:space="preserve"> AI: A SaaS Customer Support Platform with Hybrid AI Human Escalation for E Commerce</w:t>
+              <w:t>-</w:t>
+            </w:r>
+            <w:r>
+              <w:rPr>
+                <w:spacing w:val="-2"/>
+                <w:sz w:val="24"/>
+                <w:szCs w:val="24"/>
+              </w:rPr>
+              <w:t>AI: A SaaS Customer Support Platform with Hybrid AI Human Escalation for E Commerce</w:t>
             </w:r>
           </w:p>
         </w:tc>
@@ -416,7 +424,7 @@
           <w:p>
             <w:pPr>
               <w:pStyle w:val="TableParagraph"/>
-              <w:spacing w:before="111" w:line="360" w:lineRule="auto"/>
+              <w:spacing w:before="111" w:line="276" w:lineRule="auto"/>
               <w:ind w:left="110"/>
               <w:rPr>
                 <w:b/>
@@ -442,7 +450,7 @@
           <w:p>
             <w:pPr>
               <w:pStyle w:val="TableParagraph"/>
-              <w:spacing w:before="111" w:line="360" w:lineRule="auto" w:after="40"/>
+              <w:spacing w:before="111" w:after="20" w:line="276" w:lineRule="auto"/>
               <w:ind w:left="172"/>
               <w:rPr>
                 <w:spacing w:val="-10"/>
@@ -450,12 +458,6 @@
                 <w:szCs w:val="24"/>
               </w:rPr>
             </w:pPr>
-            <w:r>
-              <w:rPr>
-                <w:sz w:val="20"/>
-              </w:rPr>
-              <w:t>21 September 2026</w:t>
-            </w:r>
           </w:p>
         </w:tc>
         <w:tc>
@@ -466,7 +468,7 @@
           <w:p>
             <w:pPr>
               <w:pStyle w:val="TableParagraph"/>
-              <w:spacing w:before="111" w:line="360" w:lineRule="auto"/>
+              <w:spacing w:before="111" w:line="276" w:lineRule="auto"/>
               <w:ind w:left="109"/>
               <w:rPr>
                 <w:b/>
@@ -492,7 +494,7 @@
           <w:p>
             <w:pPr>
               <w:pStyle w:val="TableParagraph"/>
-              <w:spacing w:before="111" w:line="360" w:lineRule="auto" w:after="40"/>
+              <w:spacing w:before="111" w:after="20" w:line="276" w:lineRule="auto"/>
               <w:ind w:left="172"/>
               <w:rPr>
                 <w:sz w:val="24"/>
@@ -512,7 +514,7 @@
     <w:p>
       <w:pPr>
         <w:pStyle w:val="BodyText"/>
-        <w:spacing w:before="157" w:line="360" w:lineRule="auto"/>
+        <w:spacing w:before="157" w:line="276" w:lineRule="auto"/>
         <w:rPr>
           <w:b/>
         </w:rPr>
@@ -526,8 +528,8 @@
         <w:tblLook w:val="04A0" w:firstRow="1" w:lastRow="0" w:firstColumn="1" w:lastColumn="0" w:noHBand="0" w:noVBand="1"/>
       </w:tblPr>
       <w:tblGrid>
-        <w:gridCol w:w="2491"/>
-        <w:gridCol w:w="8101"/>
+        <w:gridCol w:w="2487"/>
+        <w:gridCol w:w="8105"/>
       </w:tblGrid>
       <w:tr>
         <w:tc>
@@ -537,7 +539,7 @@
           <w:p>
             <w:pPr>
               <w:pStyle w:val="BodyText"/>
-              <w:spacing w:line="360" w:lineRule="auto"/>
+              <w:spacing w:line="276" w:lineRule="auto"/>
               <w:jc w:val="center"/>
               <w:rPr>
                 <w:b/>
@@ -547,7 +549,7 @@
           <w:p>
             <w:pPr>
               <w:pStyle w:val="BodyText"/>
-              <w:spacing w:line="360" w:lineRule="auto"/>
+              <w:spacing w:line="276" w:lineRule="auto"/>
               <w:rPr>
                 <w:b/>
               </w:rPr>
@@ -556,7 +558,7 @@
           <w:p>
             <w:pPr>
               <w:pStyle w:val="BodyText"/>
-              <w:spacing w:line="360" w:lineRule="auto"/>
+              <w:spacing w:line="276" w:lineRule="auto"/>
               <w:jc w:val="center"/>
               <w:rPr>
                 <w:b/>
@@ -566,7 +568,76 @@
           <w:p>
             <w:pPr>
               <w:pStyle w:val="BodyText"/>
-              <w:spacing w:line="360" w:lineRule="auto"/>
+              <w:spacing w:line="276" w:lineRule="auto"/>
+              <w:jc w:val="center"/>
+              <w:rPr>
+                <w:b/>
+              </w:rPr>
+            </w:pPr>
+          </w:p>
+          <w:p>
+            <w:pPr>
+              <w:pStyle w:val="BodyText"/>
+              <w:spacing w:line="276" w:lineRule="auto"/>
+              <w:jc w:val="center"/>
+              <w:rPr>
+                <w:b/>
+              </w:rPr>
+            </w:pPr>
+          </w:p>
+          <w:p>
+            <w:pPr>
+              <w:pStyle w:val="BodyText"/>
+              <w:spacing w:line="276" w:lineRule="auto"/>
+              <w:jc w:val="center"/>
+              <w:rPr>
+                <w:b/>
+              </w:rPr>
+            </w:pPr>
+          </w:p>
+          <w:p>
+            <w:pPr>
+              <w:pStyle w:val="BodyText"/>
+              <w:spacing w:line="276" w:lineRule="auto"/>
+              <w:jc w:val="center"/>
+              <w:rPr>
+                <w:b/>
+              </w:rPr>
+            </w:pPr>
+          </w:p>
+          <w:p>
+            <w:pPr>
+              <w:pStyle w:val="BodyText"/>
+              <w:spacing w:line="276" w:lineRule="auto"/>
+              <w:rPr>
+                <w:b/>
+              </w:rPr>
+            </w:pPr>
+          </w:p>
+          <w:p>
+            <w:pPr>
+              <w:pStyle w:val="BodyText"/>
+              <w:spacing w:line="276" w:lineRule="auto"/>
+              <w:jc w:val="center"/>
+              <w:rPr>
+                <w:b/>
+              </w:rPr>
+            </w:pPr>
+          </w:p>
+          <w:p>
+            <w:pPr>
+              <w:pStyle w:val="BodyText"/>
+              <w:spacing w:line="276" w:lineRule="auto"/>
+              <w:jc w:val="center"/>
+              <w:rPr>
+                <w:b/>
+              </w:rPr>
+            </w:pPr>
+          </w:p>
+          <w:p>
+            <w:pPr>
+              <w:pStyle w:val="BodyText"/>
+              <w:spacing w:line="276" w:lineRule="auto"/>
               <w:jc w:val="center"/>
               <w:rPr>
                 <w:b/>
@@ -601,219 +672,258 @@
           <w:p>
             <w:pPr>
               <w:pStyle w:val="BodyText"/>
-              <w:spacing w:line="360" w:lineRule="auto" w:after="40"/>
+              <w:spacing w:after="20" w:line="276" w:lineRule="auto"/>
               <w:jc w:val="both"/>
               <w:rPr>
                 <w:bCs/>
-              </w:rPr>
-            </w:pPr>
-            <w:proofErr w:type="gramStart"/>
-            <w:proofErr w:type="gramEnd"/>
+                <w:sz w:val="36"/>
+                <w:szCs w:val="36"/>
+              </w:rPr>
+            </w:pPr>
             <w:r>
               <w:rPr>
-                <w:sz w:val="20"/>
-              </w:rPr>
-              <w:t>This week, my main focus was on setting up the project environment and getting the Facebook Messenger integration working end to end, so that the AI layer has a working message pipeline to build on.</w:t>
+                <w:szCs w:val="36"/>
+              </w:rPr>
+              <w:t>This week I set up the project environment and got Facebook Messenger messages flowing into the system.</w:t>
             </w:r>
           </w:p>
           <w:p>
             <w:pPr>
-              <w:spacing w:after="40"/>
+              <w:spacing w:after="60" w:line="276" w:lineRule="auto"/>
+              <w:rPr>
+                <w:sz w:val="32"/>
+                <w:szCs w:val="32"/>
+              </w:rPr>
             </w:pPr>
             <w:r>
               <w:rPr>
                 <w:b/>
-                <w:sz w:val="20"/>
+                <w:sz w:val="24"/>
+                <w:szCs w:val="32"/>
               </w:rPr>
               <w:t>Tasks Done:</w:t>
             </w:r>
           </w:p>
           <w:p>
             <w:pPr>
-              <w:spacing w:after="40"/>
+              <w:pStyle w:val="ListParagraph"/>
+              <w:numPr>
+                <w:ilvl w:val="0"/>
+                <w:numId w:val="8"/>
+              </w:numPr>
+              <w:spacing w:after="20" w:line="276" w:lineRule="auto"/>
+              <w:rPr>
+                <w:sz w:val="32"/>
+                <w:szCs w:val="32"/>
+              </w:rPr>
             </w:pPr>
             <w:r>
               <w:rPr>
-                <w:sz w:val="20"/>
-              </w:rPr>
-              <w:t>1. Created the GitHub repository (github.com/SayubShakya/eksamadhan-ai) and invited the supervisor as a collaborator.</w:t>
+                <w:sz w:val="24"/>
+                <w:szCs w:val="32"/>
+              </w:rPr>
+              <w:t>Created the GitHub repository and added my supervisor as a collaborator.</w:t>
             </w:r>
           </w:p>
           <w:p>
             <w:pPr>
-              <w:spacing w:after="40"/>
+              <w:pStyle w:val="ListParagraph"/>
+              <w:numPr>
+                <w:ilvl w:val="0"/>
+                <w:numId w:val="8"/>
+              </w:numPr>
+              <w:spacing w:after="20" w:line="276" w:lineRule="auto"/>
+              <w:rPr>
+                <w:sz w:val="32"/>
+                <w:szCs w:val="32"/>
+              </w:rPr>
             </w:pPr>
             <w:r>
               <w:rPr>
-                <w:sz w:val="20"/>
-              </w:rPr>
-              <w:t>2. Wrote the supporting documentation now held in the repository: product requirements, system architecture with justification for each technology, the twelve-week phase plan, design guidelines, engineering rules and a weekly tracking log.</w:t>
+                <w:sz w:val="24"/>
+                <w:szCs w:val="32"/>
+              </w:rPr>
+              <w:t>Wrote the project documentation: requirements, system architecture, design guidelines and the build plan.</w:t>
             </w:r>
           </w:p>
           <w:p>
             <w:pPr>
-              <w:spacing w:after="40"/>
+              <w:pStyle w:val="ListParagraph"/>
+              <w:numPr>
+                <w:ilvl w:val="0"/>
+                <w:numId w:val="8"/>
+              </w:numPr>
+              <w:spacing w:after="20" w:line="276" w:lineRule="auto"/>
+              <w:rPr>
+                <w:sz w:val="32"/>
+                <w:szCs w:val="32"/>
+              </w:rPr>
             </w:pPr>
             <w:r>
               <w:rPr>
-                <w:sz w:val="20"/>
-              </w:rPr>
-              <w:t>3. Completed the development environment: Java 21 with Spring Boot 3, PostgreSQL 16 running in Docker, and a React with Vite frontend. The build compiles and the application starts against PostgreSQL with the schema created automatically.</w:t>
+                <w:sz w:val="24"/>
+                <w:szCs w:val="32"/>
+              </w:rPr>
+              <w:t>Set up the development environment</w:t>
             </w:r>
-          </w:p>
-          <w:p>
-            <w:pPr>
-              <w:spacing w:after="40"/>
-            </w:pPr>
             <w:r>
               <w:rPr>
-                <w:sz w:val="20"/>
-              </w:rPr>
-              <w:t>4. Migrated an earlier proof of concept into the project and ported the persistence layer from MySQL to PostgreSQL, as specified in the contextual report.</w:t>
+                <w:sz w:val="24"/>
+                <w:szCs w:val="32"/>
+              </w:rPr>
+              <w:t>:</w:t>
             </w:r>
-          </w:p>
-          <w:p>
-            <w:pPr>
-              <w:spacing w:after="40"/>
-            </w:pPr>
             <w:r>
               <w:rPr>
-                <w:sz w:val="20"/>
-              </w:rPr>
-              <w:t>5. Created the Meta developer application, completed the OAuth flow, connected the Facebook Page "Eksamadhan-AI" and subscribed to the messages and messaging_postbacks webhook fields.</w:t>
+                <w:sz w:val="24"/>
+                <w:szCs w:val="32"/>
+              </w:rPr>
+              <w:t xml:space="preserve"> Java 21 with Spring Boot, PostgreSQL in Docker, and a React frontend. It builds and runs.</w:t>
             </w:r>
           </w:p>
           <w:p>
             <w:pPr>
-              <w:spacing w:after="40"/>
+              <w:pStyle w:val="ListParagraph"/>
+              <w:numPr>
+                <w:ilvl w:val="0"/>
+                <w:numId w:val="8"/>
+              </w:numPr>
+              <w:spacing w:after="20" w:line="276" w:lineRule="auto"/>
+              <w:rPr>
+                <w:sz w:val="32"/>
+                <w:szCs w:val="32"/>
+              </w:rPr>
             </w:pPr>
             <w:r>
               <w:rPr>
-                <w:sz w:val="20"/>
-              </w:rPr>
-              <w:t>6. Deployed a small proxy service on Vercel with Upstash Redis, so that Meta has one fixed callback URL while the backend runs locally behind a changing development tunnel.</w:t>
+                <w:sz w:val="24"/>
+                <w:szCs w:val="32"/>
+              </w:rPr>
+              <w:t>Created the Meta developer app, connected the Facebook Page and configured the webhook.</w:t>
             </w:r>
           </w:p>
           <w:p>
             <w:pPr>
-              <w:spacing w:after="40"/>
+              <w:pStyle w:val="ListParagraph"/>
+              <w:numPr>
+                <w:ilvl w:val="0"/>
+                <w:numId w:val="8"/>
+              </w:numPr>
+              <w:spacing w:after="20" w:line="276" w:lineRule="auto"/>
+              <w:rPr>
+                <w:sz w:val="32"/>
+                <w:szCs w:val="32"/>
+              </w:rPr>
             </w:pPr>
             <w:r>
               <w:rPr>
-                <w:sz w:val="20"/>
-              </w:rPr>
-              <w:t>7. Verified the integration end to end: a real Messenger message sent from a second account travelled from Meta through the proxy and tunnel into PostgreSQL in approximately fifty milliseconds, and the duplicate-detection logic was confirmed working.</w:t>
+                <w:sz w:val="24"/>
+                <w:szCs w:val="32"/>
+              </w:rPr>
+              <w:t>Tested it end to end: a real Messenger message from another account reached the database in under a second.</w:t>
             </w:r>
           </w:p>
           <w:p>
             <w:pPr>
-              <w:spacing w:after="40"/>
+              <w:spacing w:after="60" w:line="276" w:lineRule="auto"/>
+              <w:rPr>
+                <w:sz w:val="32"/>
+                <w:szCs w:val="32"/>
+              </w:rPr>
             </w:pPr>
             <w:r>
               <w:rPr>
-                <w:sz w:val="20"/>
-              </w:rPr>
-              <w:t>8. Secured the webhook endpoint with X-Hub-Signature-256 verification, using an HMAC over the raw request body and a constant-time comparison, so forged requests are rejected.</w:t>
-            </w:r>
-          </w:p>
-          <w:p>
-            <w:pPr>
-              <w:spacing w:after="40"/>
-            </w:pPr>
-            <w:r>
-              <w:rPr>
-                <w:sz w:val="20"/>
-              </w:rPr>
-              <w:t>9. Rebuilt the user interface to the approved design: a unified inbox, a home screen with a setup checklist, a collapsible navigation rail, the project logo, and a responsive layout.</w:t>
-            </w:r>
-          </w:p>
-          <w:p>
-            <w:pPr>
-              <w:spacing w:after="40"/>
-            </w:pPr>
-            <w:r>
-              <w:rPr>
-                <w:sz w:val="20"/>
-              </w:rPr>
-              <w:t>10. Installed CodeRabbit for automated code review on the repository.</w:t>
-            </w:r>
-          </w:p>
-          <w:p>
-            <w:pPr>
-              <w:spacing w:after="40"/>
-            </w:pPr>
-            <w:r>
-              <w:rPr>
-                <w:sz w:val="20"/>
-              </w:rPr>
-              <w:t>Evidence in the repository: 29 commits across 15 and 16 September 2026, covering 75 files and 9,626 lines of code and documentation.</w:t>
-            </w:r>
-          </w:p>
-          <w:p>
-            <w:pPr>
-              <w:spacing w:after="40"/>
-            </w:pPr>
-            <w:r>
-              <w:rPr>
-                <w:b/>
-                <w:sz w:val="20"/>
+                <w:b/>
+                <w:sz w:val="24"/>
+                <w:szCs w:val="32"/>
               </w:rPr>
               <w:t>Issues and Roadblocks:</w:t>
             </w:r>
           </w:p>
           <w:p>
             <w:pPr>
-              <w:spacing w:after="40"/>
+              <w:pStyle w:val="ListParagraph"/>
+              <w:numPr>
+                <w:ilvl w:val="0"/>
+                <w:numId w:val="10"/>
+              </w:numPr>
+              <w:spacing w:after="20" w:line="276" w:lineRule="auto"/>
+              <w:rPr>
+                <w:sz w:val="32"/>
+                <w:szCs w:val="32"/>
+              </w:rPr>
             </w:pPr>
             <w:r>
               <w:rPr>
-                <w:sz w:val="20"/>
-              </w:rPr>
-              <w:t>1. The Instagram Business account could not be linked to the Facebook Page. Meta applied a temporary action restriction after several authentication attempts in a short period. This clears automatically and will be retried; it does not block the Facebook channel.</w:t>
+                <w:b/>
+                <w:bCs/>
+                <w:sz w:val="24"/>
+                <w:szCs w:val="32"/>
+              </w:rPr>
+              <w:t>Instagram could not be linked yet.</w:t>
             </w:r>
-          </w:p>
-          <w:p>
-            <w:pPr>
-              <w:spacing w:after="40"/>
-            </w:pPr>
             <w:r>
               <w:rPr>
-                <w:sz w:val="20"/>
-              </w:rPr>
-              <w:t>2. While the Meta application is in Development Mode, webhooks are only delivered for users holding a role on the app. Testing therefore required registering a second Facebook developer account, which in turn required a phone number not already registered to the primary account.</w:t>
+                <w:sz w:val="24"/>
+                <w:szCs w:val="32"/>
+              </w:rPr>
+              <w:t xml:space="preserve"> Meta placed a temporary restriction on the account after repeated login attempts. It clears on its own, and Facebook is unaffected.</w:t>
             </w:r>
           </w:p>
           <w:p>
             <w:pPr>
-              <w:spacing w:after="40"/>
+              <w:pStyle w:val="ListParagraph"/>
+              <w:numPr>
+                <w:ilvl w:val="0"/>
+                <w:numId w:val="10"/>
+              </w:numPr>
+              <w:spacing w:after="20" w:line="276" w:lineRule="auto"/>
+              <w:rPr>
+                <w:sz w:val="32"/>
+                <w:szCs w:val="32"/>
+              </w:rPr>
             </w:pPr>
             <w:r>
               <w:rPr>
-                <w:sz w:val="20"/>
-              </w:rPr>
-              <w:t>3. Free development tunnels expire after sixty minutes and return a different hostname on reconnection, which breaks the fixed callback URL Meta requires. This was solved with the Vercel proxy and an automatic re-registration loop.</w:t>
+                <w:b/>
+                <w:bCs/>
+                <w:sz w:val="24"/>
+                <w:szCs w:val="32"/>
+              </w:rPr>
+              <w:t>While the app is in development mode</w:t>
             </w:r>
-          </w:p>
-          <w:p>
-            <w:pPr>
-              <w:spacing w:after="40"/>
-            </w:pPr>
             <w:r>
               <w:rPr>
-                <w:sz w:val="20"/>
-              </w:rPr>
-              <w:t>4. Webhook signatures must be computed over the exact bytes Meta sends. The proxy was re-serialising the JSON payload, which would have caused every genuine webhook to be rejected as forged. The proxy now forwards the untouched request body.</w:t>
+                <w:sz w:val="24"/>
+                <w:szCs w:val="32"/>
+              </w:rPr>
+              <w:t>, Meta only delivers messages from accounts registered to it, so testing required a second developer account.</w:t>
             </w:r>
           </w:p>
           <w:p>
             <w:pPr>
-              <w:spacing w:after="40"/>
+              <w:pStyle w:val="ListParagraph"/>
+              <w:numPr>
+                <w:ilvl w:val="0"/>
+                <w:numId w:val="10"/>
+              </w:numPr>
+              <w:spacing w:after="20" w:line="276" w:lineRule="auto"/>
             </w:pPr>
             <w:r>
               <w:rPr>
-                <w:sz w:val="20"/>
-              </w:rPr>
-              <w:t>5. A database password had been committed in the history of the earlier proof of concept and must be rotated.</w:t>
+                <w:b/>
+                <w:bCs/>
+                <w:sz w:val="24"/>
+                <w:szCs w:val="32"/>
+              </w:rPr>
+              <w:t>The development tunnel address changes every hour</w:t>
+            </w:r>
+            <w:r>
+              <w:rPr>
+                <w:sz w:val="24"/>
+                <w:szCs w:val="32"/>
+              </w:rPr>
+              <w:t>, which broke the fixed address Meta requires. I solved this with a small proxy service that keeps the address stable.</w:t>
             </w:r>
           </w:p>
         </w:tc>
@@ -826,7 +936,7 @@
           <w:p>
             <w:pPr>
               <w:pStyle w:val="BodyText"/>
-              <w:spacing w:line="360" w:lineRule="auto"/>
+              <w:spacing w:line="276" w:lineRule="auto"/>
               <w:jc w:val="center"/>
               <w:rPr>
                 <w:b/>
@@ -836,7 +946,7 @@
           <w:p>
             <w:pPr>
               <w:pStyle w:val="BodyText"/>
-              <w:spacing w:line="360" w:lineRule="auto"/>
+              <w:spacing w:line="276" w:lineRule="auto"/>
               <w:jc w:val="center"/>
               <w:rPr>
                 <w:b/>
@@ -846,7 +956,7 @@
           <w:p>
             <w:pPr>
               <w:pStyle w:val="BodyText"/>
-              <w:spacing w:line="360" w:lineRule="auto"/>
+              <w:spacing w:line="276" w:lineRule="auto"/>
               <w:jc w:val="center"/>
               <w:rPr>
                 <w:b/>
@@ -856,8 +966,7 @@
           <w:p>
             <w:pPr>
               <w:pStyle w:val="BodyText"/>
-              <w:spacing w:line="360" w:lineRule="auto"/>
-              <w:jc w:val="center"/>
+              <w:spacing w:line="276" w:lineRule="auto"/>
               <w:rPr>
                 <w:b/>
               </w:rPr>
@@ -866,7 +975,7 @@
           <w:p>
             <w:pPr>
               <w:pStyle w:val="BodyText"/>
-              <w:spacing w:line="360" w:lineRule="auto"/>
+              <w:spacing w:line="276" w:lineRule="auto"/>
               <w:jc w:val="center"/>
               <w:rPr>
                 <w:b/>
@@ -889,74 +998,109 @@
               <w:pStyle w:val="BodyText"/>
               <w:numPr>
                 <w:ilvl w:val="0"/>
-                <w:numId w:val="5"/>
+                <w:numId w:val="12"/>
               </w:numPr>
-              <w:spacing w:line="360" w:lineRule="auto" w:after="40"/>
+              <w:spacing w:after="20" w:line="276" w:lineRule="auto"/>
               <w:jc w:val="both"/>
               <w:rPr>
                 <w:bCs/>
+                <w:sz w:val="36"/>
+                <w:szCs w:val="36"/>
               </w:rPr>
             </w:pPr>
             <w:r>
               <w:rPr>
-                <w:sz w:val="20"/>
-              </w:rPr>
-              <w:t>1. Submit the Meta App Review request for the pages_messaging, instagram_basic and instagram_manage_messages permissions. Approval can take several weeks and is required before anyone outside the app roles can message the page, so this is being started early.</w:t>
+                <w:b/>
+                <w:bCs/>
+                <w:szCs w:val="36"/>
+              </w:rPr>
+              <w:t>Submit the Meta App Review</w:t>
             </w:r>
-          </w:p>
-          <w:p>
-            <w:pPr>
-              <w:spacing w:after="40"/>
-            </w:pPr>
             <w:r>
               <w:rPr>
-                <w:sz w:val="20"/>
-              </w:rPr>
-              <w:t>2. Complete the Instagram Business account link once the temporary restriction lifts, and confirm Instagram direct messages arrive in the same inbox.</w:t>
+                <w:szCs w:val="36"/>
+              </w:rPr>
+              <w:t>. It is needed before people outside my test accounts can message the page, and takes several weeks, so I am starting now.</w:t>
             </w:r>
           </w:p>
           <w:p>
             <w:pPr>
-              <w:spacing w:after="40"/>
+              <w:pStyle w:val="ListParagraph"/>
+              <w:numPr>
+                <w:ilvl w:val="0"/>
+                <w:numId w:val="12"/>
+              </w:numPr>
+              <w:spacing w:after="20" w:line="276" w:lineRule="auto"/>
+              <w:rPr>
+                <w:sz w:val="32"/>
+                <w:szCs w:val="32"/>
+              </w:rPr>
             </w:pPr>
             <w:r>
               <w:rPr>
-                <w:sz w:val="20"/>
-              </w:rPr>
-              <w:t>3. Replace the hardcoded tenant identifier with OAuth 2.0 and JWT authentication and a proper organisation and user model, as described in section 5.4.3 of the contextual report.</w:t>
+                <w:sz w:val="24"/>
+                <w:szCs w:val="32"/>
+              </w:rPr>
+              <w:t>Add proper login using OAuth 2.0 and JWT, replacing the temporary account currently hardcoded.</w:t>
             </w:r>
           </w:p>
           <w:p>
             <w:pPr>
-              <w:spacing w:after="40"/>
+              <w:pStyle w:val="ListParagraph"/>
+              <w:numPr>
+                <w:ilvl w:val="0"/>
+                <w:numId w:val="12"/>
+              </w:numPr>
+              <w:spacing w:after="20" w:line="276" w:lineRule="auto"/>
+              <w:rPr>
+                <w:sz w:val="32"/>
+                <w:szCs w:val="32"/>
+              </w:rPr>
             </w:pPr>
             <w:r>
               <w:rPr>
-                <w:sz w:val="20"/>
-              </w:rPr>
-              <w:t>4. Introduce a Thread entity with the status machine AI_HANDLING, OPEN_FOR_AGENT, AGENT_HANDLING and RESOLVED. The escalation feature depends on this and it is required before the intelligence layer can be built.</w:t>
+                <w:sz w:val="24"/>
+                <w:szCs w:val="32"/>
+              </w:rPr>
+              <w:t>Restructure messages into conversation threads with a status. The escalation feature depends on this.</w:t>
             </w:r>
           </w:p>
           <w:p>
             <w:pPr>
-              <w:spacing w:after="40"/>
+              <w:pStyle w:val="ListParagraph"/>
+              <w:numPr>
+                <w:ilvl w:val="0"/>
+                <w:numId w:val="12"/>
+              </w:numPr>
+              <w:spacing w:after="20" w:line="276" w:lineRule="auto"/>
+              <w:rPr>
+                <w:sz w:val="32"/>
+                <w:szCs w:val="32"/>
+              </w:rPr>
             </w:pPr>
             <w:r>
               <w:rPr>
-                <w:sz w:val="20"/>
-              </w:rPr>
-              <w:t>5. Add Flyway database migrations in place of automatic schema generation.</w:t>
+                <w:sz w:val="24"/>
+                <w:szCs w:val="32"/>
+              </w:rPr>
+              <w:t>Link the Instagram account once the restriction lifts.</w:t>
             </w:r>
           </w:p>
           <w:p>
             <w:pPr>
-              <w:spacing w:after="40"/>
+              <w:pStyle w:val="ListParagraph"/>
+              <w:numPr>
+                <w:ilvl w:val="0"/>
+                <w:numId w:val="12"/>
+              </w:numPr>
+              <w:spacing w:after="20" w:line="276" w:lineRule="auto"/>
             </w:pPr>
             <w:r>
               <w:rPr>
-                <w:sz w:val="20"/>
-              </w:rPr>
-              <w:t>6. Begin Phase 2 of the implementation plan, weeks four to six: knowledge ingestion from text, PDF and URL sources, embedding generation with the OpenAI API, storage and semantic retrieval in Pinecone, and the confidence gate that decides whether the AI answers or escalates.</w:t>
+                <w:sz w:val="24"/>
+                <w:szCs w:val="32"/>
+              </w:rPr>
+              <w:t>Begin the AI knowledge engine: uploading business documents, generating embeddings and storing them in Pinecone for search.</w:t>
             </w:r>
           </w:p>
         </w:tc>
@@ -969,8 +1113,7 @@
           <w:p>
             <w:pPr>
               <w:pStyle w:val="BodyText"/>
-              <w:spacing w:line="360" w:lineRule="auto"/>
-              <w:jc w:val="center"/>
+              <w:spacing w:line="276" w:lineRule="auto"/>
               <w:rPr>
                 <w:b/>
               </w:rPr>
@@ -979,8 +1122,7 @@
           <w:p>
             <w:pPr>
               <w:pStyle w:val="BodyText"/>
-              <w:spacing w:line="360" w:lineRule="auto"/>
-              <w:jc w:val="center"/>
+              <w:spacing w:line="276" w:lineRule="auto"/>
               <w:rPr>
                 <w:b/>
               </w:rPr>
@@ -989,8 +1131,7 @@
           <w:p>
             <w:pPr>
               <w:pStyle w:val="BodyText"/>
-              <w:spacing w:line="360" w:lineRule="auto"/>
-              <w:jc w:val="center"/>
+              <w:spacing w:line="276" w:lineRule="auto"/>
               <w:rPr>
                 <w:b/>
               </w:rPr>
@@ -999,26 +1140,7 @@
           <w:p>
             <w:pPr>
               <w:pStyle w:val="BodyText"/>
-              <w:spacing w:line="360" w:lineRule="auto"/>
-              <w:rPr>
-                <w:b/>
-              </w:rPr>
-            </w:pPr>
-          </w:p>
-          <w:p>
-            <w:pPr>
-              <w:pStyle w:val="BodyText"/>
-              <w:spacing w:line="360" w:lineRule="auto"/>
-              <w:jc w:val="center"/>
-              <w:rPr>
-                <w:b/>
-              </w:rPr>
-            </w:pPr>
-          </w:p>
-          <w:p>
-            <w:pPr>
-              <w:pStyle w:val="BodyText"/>
-              <w:spacing w:line="360" w:lineRule="auto"/>
+              <w:spacing w:line="276" w:lineRule="auto"/>
               <w:jc w:val="center"/>
               <w:rPr>
                 <w:b/>
@@ -1046,7 +1168,7 @@
           <w:p>
             <w:pPr>
               <w:pStyle w:val="BodyText"/>
-              <w:spacing w:line="360" w:lineRule="auto"/>
+              <w:spacing w:line="276" w:lineRule="auto"/>
               <w:rPr>
                 <w:b/>
               </w:rPr>
@@ -1055,7 +1177,7 @@
           <w:p>
             <w:pPr>
               <w:pStyle w:val="BodyText"/>
-              <w:spacing w:line="360" w:lineRule="auto"/>
+              <w:spacing w:line="276" w:lineRule="auto"/>
               <w:rPr>
                 <w:b/>
               </w:rPr>
@@ -1064,7 +1186,7 @@
           <w:p>
             <w:pPr>
               <w:pStyle w:val="BodyText"/>
-              <w:spacing w:line="360" w:lineRule="auto"/>
+              <w:spacing w:line="276" w:lineRule="auto"/>
               <w:rPr>
                 <w:b/>
               </w:rPr>
@@ -1073,7 +1195,7 @@
           <w:p>
             <w:pPr>
               <w:pStyle w:val="BodyText"/>
-              <w:spacing w:line="360" w:lineRule="auto"/>
+              <w:spacing w:line="276" w:lineRule="auto"/>
               <w:rPr>
                 <w:b/>
               </w:rPr>
@@ -1082,7 +1204,7 @@
           <w:p>
             <w:pPr>
               <w:pStyle w:val="BodyText"/>
-              <w:spacing w:line="360" w:lineRule="auto"/>
+              <w:spacing w:line="276" w:lineRule="auto"/>
               <w:rPr>
                 <w:b/>
               </w:rPr>
@@ -1091,7 +1213,7 @@
           <w:p>
             <w:pPr>
               <w:pStyle w:val="BodyText"/>
-              <w:spacing w:line="360" w:lineRule="auto"/>
+              <w:spacing w:line="276" w:lineRule="auto"/>
               <w:rPr>
                 <w:b/>
               </w:rPr>
@@ -1100,52 +1222,7 @@
           <w:p>
             <w:pPr>
               <w:pStyle w:val="BodyText"/>
-              <w:spacing w:line="360" w:lineRule="auto"/>
-              <w:rPr>
-                <w:b/>
-              </w:rPr>
-            </w:pPr>
-          </w:p>
-          <w:p>
-            <w:pPr>
-              <w:pStyle w:val="BodyText"/>
-              <w:spacing w:line="360" w:lineRule="auto"/>
-              <w:rPr>
-                <w:b/>
-              </w:rPr>
-            </w:pPr>
-          </w:p>
-          <w:p>
-            <w:pPr>
-              <w:pStyle w:val="BodyText"/>
-              <w:spacing w:line="360" w:lineRule="auto"/>
-              <w:rPr>
-                <w:b/>
-              </w:rPr>
-            </w:pPr>
-          </w:p>
-          <w:p>
-            <w:pPr>
-              <w:pStyle w:val="BodyText"/>
-              <w:spacing w:line="360" w:lineRule="auto"/>
-              <w:rPr>
-                <w:b/>
-              </w:rPr>
-            </w:pPr>
-          </w:p>
-          <w:p>
-            <w:pPr>
-              <w:pStyle w:val="BodyText"/>
-              <w:spacing w:line="360" w:lineRule="auto"/>
-              <w:rPr>
-                <w:b/>
-              </w:rPr>
-            </w:pPr>
-          </w:p>
-          <w:p>
-            <w:pPr>
-              <w:pStyle w:val="BodyText"/>
-              <w:spacing w:line="360" w:lineRule="auto"/>
+              <w:spacing w:line="276" w:lineRule="auto"/>
               <w:rPr>
                 <w:b/>
               </w:rPr>
@@ -1154,11 +1231,19 @@
         </w:tc>
       </w:tr>
     </w:tbl>
-    <w:p/>
-    <w:p/>
     <w:p>
       <w:pPr>
-        <w:spacing w:line="360" w:lineRule="auto"/>
+        <w:spacing w:line="276" w:lineRule="auto"/>
+      </w:pPr>
+    </w:p>
+    <w:p>
+      <w:pPr>
+        <w:spacing w:line="276" w:lineRule="auto"/>
+      </w:pPr>
+    </w:p>
+    <w:p>
+      <w:pPr>
+        <w:spacing w:line="276" w:lineRule="auto"/>
         <w:rPr>
           <w:sz w:val="24"/>
           <w:szCs w:val="24"/>
@@ -1202,7 +1287,7 @@
     </w:p>
     <w:p>
       <w:pPr>
-        <w:spacing w:line="360" w:lineRule="auto"/>
+        <w:spacing w:line="276" w:lineRule="auto"/>
         <w:rPr>
           <w:sz w:val="24"/>
           <w:szCs w:val="24"/>
@@ -1247,11 +1332,18 @@
     </w:p>
     <w:p>
       <w:pPr>
-        <w:spacing w:line="360" w:lineRule="auto"/>
+        <w:spacing w:line="276" w:lineRule="auto"/>
         <w:rPr>
           <w:sz w:val="24"/>
           <w:szCs w:val="24"/>
         </w:rPr>
+        <w:sectPr>
+          <w:headerReference w:type="default" r:id="rId7"/>
+          <w:pgSz w:w="12240" w:h="15840"/>
+          <w:pgMar w:top="640" w:right="720" w:bottom="280" w:left="720" w:header="182" w:footer="0" w:gutter="0"/>
+          <w:pgNumType w:start="1"/>
+          <w:cols w:space="720"/>
+        </w:sectPr>
       </w:pPr>
       <w:r>
         <w:rPr>
@@ -1259,29 +1351,14 @@
           <w:szCs w:val="24"/>
         </w:rPr>
         <w:br/>
-        <w:t>When signed this form must be scanned and submitted via the relevant link on BREO.</w:t>
+        <w:t>When signed this form must be scanned and submitted via the relevant link on BREO</w:t>
       </w:r>
     </w:p>
     <w:p>
       <w:pPr>
-        <w:tabs>
-          <w:tab w:val="left" w:pos="1590"/>
-        </w:tabs>
-        <w:sectPr>
-          <w:headerReference w:type="default" r:id="rId5"/>
-          <w:pgSz w:w="12240" w:h="15840"/>
-          <w:pgMar w:top="640" w:right="720" w:bottom="280" w:left="720" w:header="182" w:footer="0" w:gutter="0"/>
-          <w:pgNumType w:start="1"/>
-          <w:cols w:space="720"/>
-        </w:sectPr>
+        <w:spacing w:line="276" w:lineRule="auto"/>
       </w:pPr>
     </w:p>
-    <w:p>
-      <w:pPr>
-        <w:spacing w:line="360" w:lineRule="auto"/>
-      </w:pPr>
-    </w:p>
-    <w:p/>
     <w:sectPr>
       <w:pgSz w:w="12240" w:h="15840"/>
       <w:pgMar w:top="640" w:right="720" w:bottom="280" w:left="720" w:header="182" w:footer="0" w:gutter="0"/>
@@ -1289,6 +1366,44 @@
     </w:sectPr>
   </w:body>
 </w:document>
+</file>
+
+<file path=word/endnotes.xml><?xml version="1.0" encoding="utf-8"?>
+<w:endnotes xmlns:wpc="http://schemas.microsoft.com/office/word/2010/wordprocessingCanvas" xmlns:cx="http://schemas.microsoft.com/office/drawing/2014/chartex" xmlns:cx1="http://schemas.microsoft.com/office/drawing/2015/9/8/chartex" xmlns:cx2="http://schemas.microsoft.com/office/drawing/2015/10/21/chartex" xmlns:cx3="http://schemas.microsoft.com/office/drawing/2016/5/9/chartex" xmlns:cx4="http://schemas.microsoft.com/office/drawing/2016/5/10/chartex" xmlns:cx5="http://schemas.microsoft.com/office/drawing/2016/5/11/chartex" xmlns:cx6="http://schemas.microsoft.com/office/drawing/2016/5/12/chartex" xmlns:cx7="http://schemas.microsoft.com/office/drawing/2016/5/13/chartex" xmlns:cx8="http://schemas.microsoft.com/office/drawing/2016/5/14/chartex" xmlns:mc="http://schemas.openxmlformats.org/markup-compatibility/2006" xmlns:m="http://schemas.openxmlformats.org/officeDocument/2006/math" xmlns:aink="http://schemas.microsoft.com/office/drawing/2016/ink" xmlns:am3d="http://schemas.microsoft.com/office/drawing/2017/model3d" xmlns:oel="http://schemas.microsoft.com/office/2019/extlst" xmlns:r="http://schemas.openxmlformats.org/officeDocument/2006/relationships" xmlns:wp14="http://schemas.microsoft.com/office/word/2010/wordprocessingDrawing" xmlns:wp="http://schemas.openxmlformats.org/drawingml/2006/wordprocessingDrawing" xmlns:wpg="http://schemas.microsoft.com/office/word/2010/wordprocessingGroup" xmlns:wpi="http://schemas.microsoft.com/office/word/2010/wordprocessingInk" xmlns:wps="http://schemas.microsoft.com/office/word/2010/wordprocessingShape" xmlns:o="urn:schemas-microsoft-com:office:office" xmlns:v="urn:schemas-microsoft-com:vml" xmlns:w10="urn:schemas-microsoft-com:office:word" xmlns:w="http://schemas.openxmlformats.org/wordprocessingml/2006/main" xmlns:w14="http://schemas.microsoft.com/office/word/2010/wordml" xmlns:w15="http://schemas.microsoft.com/office/word/2012/wordml" xmlns:w16cex="http://schemas.microsoft.com/office/word/2018/wordml/cex" xmlns:w16cid="http://schemas.microsoft.com/office/word/2016/wordml/cid" xmlns:w16="http://schemas.microsoft.com/office/word/2018/wordml" xmlns:w16sdtdh="http://schemas.microsoft.com/office/word/2020/wordml/sdtdatahash" xmlns:w16sdtfl="http://schemas.microsoft.com/office/word/2024/wordml/sdtformatlock" xmlns:w16se="http://schemas.microsoft.com/office/word/2015/wordml/symex" xmlns:w16du="http://schemas.microsoft.com/office/word/2023/wordml/word16du" xmlns:wne="http://schemas.microsoft.com/office/word/2006/wordml" mc:Ignorable="w14 w15 w16se w16cid w16 w16cex w16sdtdh w16sdtfl w16du wp14">
+  <w:endnote w:type="separator" w:id="-1">
+    <w:p>
+      <w:r>
+        <w:separator/>
+      </w:r>
+    </w:p>
+  </w:endnote>
+  <w:endnote w:type="continuationSeparator" w:id="0">
+    <w:p>
+      <w:r>
+        <w:continuationSeparator/>
+      </w:r>
+    </w:p>
+  </w:endnote>
+</w:endnotes>
+</file>
+
+<file path=word/footnotes.xml><?xml version="1.0" encoding="utf-8"?>
+<w:footnotes xmlns:wpc="http://schemas.microsoft.com/office/word/2010/wordprocessingCanvas" xmlns:cx="http://schemas.microsoft.com/office/drawing/2014/chartex" xmlns:cx1="http://schemas.microsoft.com/office/drawing/2015/9/8/chartex" xmlns:cx2="http://schemas.microsoft.com/office/drawing/2015/10/21/chartex" xmlns:cx3="http://schemas.microsoft.com/office/drawing/2016/5/9/chartex" xmlns:cx4="http://schemas.microsoft.com/office/drawing/2016/5/10/chartex" xmlns:cx5="http://schemas.microsoft.com/office/drawing/2016/5/11/chartex" xmlns:cx6="http://schemas.microsoft.com/office/drawing/2016/5/12/chartex" xmlns:cx7="http://schemas.microsoft.com/office/drawing/2016/5/13/chartex" xmlns:cx8="http://schemas.microsoft.com/office/drawing/2016/5/14/chartex" xmlns:mc="http://schemas.openxmlformats.org/markup-compatibility/2006" xmlns:m="http://schemas.openxmlformats.org/officeDocument/2006/math" xmlns:aink="http://schemas.microsoft.com/office/drawing/2016/ink" xmlns:am3d="http://schemas.microsoft.com/office/drawing/2017/model3d" xmlns:oel="http://schemas.microsoft.com/office/2019/extlst" xmlns:r="http://schemas.openxmlformats.org/officeDocument/2006/relationships" xmlns:wp14="http://schemas.microsoft.com/office/word/2010/wordprocessingDrawing" xmlns:wp="http://schemas.openxmlformats.org/drawingml/2006/wordprocessingDrawing" xmlns:wpg="http://schemas.microsoft.com/office/word/2010/wordprocessingGroup" xmlns:wpi="http://schemas.microsoft.com/office/word/2010/wordprocessingInk" xmlns:wps="http://schemas.microsoft.com/office/word/2010/wordprocessingShape" xmlns:o="urn:schemas-microsoft-com:office:office" xmlns:v="urn:schemas-microsoft-com:vml" xmlns:w10="urn:schemas-microsoft-com:office:word" xmlns:w="http://schemas.openxmlformats.org/wordprocessingml/2006/main" xmlns:w14="http://schemas.microsoft.com/office/word/2010/wordml" xmlns:w15="http://schemas.microsoft.com/office/word/2012/wordml" xmlns:w16cex="http://schemas.microsoft.com/office/word/2018/wordml/cex" xmlns:w16cid="http://schemas.microsoft.com/office/word/2016/wordml/cid" xmlns:w16="http://schemas.microsoft.com/office/word/2018/wordml" xmlns:w16sdtdh="http://schemas.microsoft.com/office/word/2020/wordml/sdtdatahash" xmlns:w16sdtfl="http://schemas.microsoft.com/office/word/2024/wordml/sdtformatlock" xmlns:w16se="http://schemas.microsoft.com/office/word/2015/wordml/symex" xmlns:w16du="http://schemas.microsoft.com/office/word/2023/wordml/word16du" xmlns:wne="http://schemas.microsoft.com/office/word/2006/wordml" mc:Ignorable="w14 w15 w16se w16cid w16 w16cex w16sdtdh w16sdtfl w16du wp14">
+  <w:footnote w:type="separator" w:id="-1">
+    <w:p>
+      <w:r>
+        <w:separator/>
+      </w:r>
+    </w:p>
+  </w:footnote>
+  <w:footnote w:type="continuationSeparator" w:id="0">
+    <w:p>
+      <w:r>
+        <w:continuationSeparator/>
+      </w:r>
+    </w:p>
+  </w:footnote>
+</w:footnotes>
 </file>
 
 <file path=word/header1.xml><?xml version="1.0" encoding="utf-8"?>
@@ -1396,6 +1511,96 @@
 <file path=word/numbering.xml><?xml version="1.0" encoding="utf-8"?>
 <w:numbering xmlns:wpc="http://schemas.microsoft.com/office/word/2010/wordprocessingCanvas" xmlns:cx="http://schemas.microsoft.com/office/drawing/2014/chartex" xmlns:cx1="http://schemas.microsoft.com/office/drawing/2015/9/8/chartex" xmlns:cx2="http://schemas.microsoft.com/office/drawing/2015/10/21/chartex" xmlns:cx3="http://schemas.microsoft.com/office/drawing/2016/5/9/chartex" xmlns:cx4="http://schemas.microsoft.com/office/drawing/2016/5/10/chartex" xmlns:cx5="http://schemas.microsoft.com/office/drawing/2016/5/11/chartex" xmlns:cx6="http://schemas.microsoft.com/office/drawing/2016/5/12/chartex" xmlns:cx7="http://schemas.microsoft.com/office/drawing/2016/5/13/chartex" xmlns:cx8="http://schemas.microsoft.com/office/drawing/2016/5/14/chartex" xmlns:mc="http://schemas.openxmlformats.org/markup-compatibility/2006" xmlns:m="http://schemas.openxmlformats.org/officeDocument/2006/math" xmlns:aink="http://schemas.microsoft.com/office/drawing/2016/ink" xmlns:am3d="http://schemas.microsoft.com/office/drawing/2017/model3d" xmlns:oel="http://schemas.microsoft.com/office/2019/extlst" xmlns:r="http://schemas.openxmlformats.org/officeDocument/2006/relationships" xmlns:wp14="http://schemas.microsoft.com/office/word/2010/wordprocessingDrawing" xmlns:wp="http://schemas.openxmlformats.org/drawingml/2006/wordprocessingDrawing" xmlns:wpg="http://schemas.microsoft.com/office/word/2010/wordprocessingGroup" xmlns:wpi="http://schemas.microsoft.com/office/word/2010/wordprocessingInk" xmlns:wps="http://schemas.microsoft.com/office/word/2010/wordprocessingShape" xmlns:o="urn:schemas-microsoft-com:office:office" xmlns:v="urn:schemas-microsoft-com:vml" xmlns:w10="urn:schemas-microsoft-com:office:word" xmlns:w="http://schemas.openxmlformats.org/wordprocessingml/2006/main" xmlns:w14="http://schemas.microsoft.com/office/word/2010/wordml" xmlns:w15="http://schemas.microsoft.com/office/word/2012/wordml" xmlns:w16cex="http://schemas.microsoft.com/office/word/2018/wordml/cex" xmlns:w16cid="http://schemas.microsoft.com/office/word/2016/wordml/cid" xmlns:w16="http://schemas.microsoft.com/office/word/2018/wordml" xmlns:w16sdtdh="http://schemas.microsoft.com/office/word/2020/wordml/sdtdatahash" xmlns:w16sdtfl="http://schemas.microsoft.com/office/word/2024/wordml/sdtformatlock" xmlns:w16se="http://schemas.microsoft.com/office/word/2015/wordml/symex" xmlns:w16du="http://schemas.microsoft.com/office/word/2023/wordml/word16du" xmlns:wne="http://schemas.microsoft.com/office/word/2006/wordml" mc:Ignorable="w14 w15 w16se w16cid w16 w16cex w16sdtdh w16sdtfl w16du wp14">
   <w:abstractNum w:abstractNumId="0" w15:restartNumberingAfterBreak="0">
+    <w:nsid w:val="02CC69A3"/>
+    <w:multiLevelType w:val="hybridMultilevel"/>
+    <w:tmpl w:val="B0CE494A"/>
+    <w:lvl w:ilvl="0" w:tplc="9F8EA0A6">
+      <w:start w:val="1"/>
+      <w:numFmt w:val="decimal"/>
+      <w:lvlText w:val="%1."/>
+      <w:lvlJc w:val="left"/>
+      <w:pPr>
+        <w:ind w:left="720" w:hanging="360"/>
+      </w:pPr>
+      <w:rPr>
+        <w:sz w:val="24"/>
+        <w:szCs w:val="24"/>
+      </w:rPr>
+    </w:lvl>
+    <w:lvl w:ilvl="1" w:tplc="04090019" w:tentative="1">
+      <w:start w:val="1"/>
+      <w:numFmt w:val="lowerLetter"/>
+      <w:lvlText w:val="%2."/>
+      <w:lvlJc w:val="left"/>
+      <w:pPr>
+        <w:ind w:left="1440" w:hanging="360"/>
+      </w:pPr>
+    </w:lvl>
+    <w:lvl w:ilvl="2" w:tplc="0409001B" w:tentative="1">
+      <w:start w:val="1"/>
+      <w:numFmt w:val="lowerRoman"/>
+      <w:lvlText w:val="%3."/>
+      <w:lvlJc w:val="right"/>
+      <w:pPr>
+        <w:ind w:left="2160" w:hanging="180"/>
+      </w:pPr>
+    </w:lvl>
+    <w:lvl w:ilvl="3" w:tplc="0409000F" w:tentative="1">
+      <w:start w:val="1"/>
+      <w:numFmt w:val="decimal"/>
+      <w:lvlText w:val="%4."/>
+      <w:lvlJc w:val="left"/>
+      <w:pPr>
+        <w:ind w:left="2880" w:hanging="360"/>
+      </w:pPr>
+    </w:lvl>
+    <w:lvl w:ilvl="4" w:tplc="04090019" w:tentative="1">
+      <w:start w:val="1"/>
+      <w:numFmt w:val="lowerLetter"/>
+      <w:lvlText w:val="%5."/>
+      <w:lvlJc w:val="left"/>
+      <w:pPr>
+        <w:ind w:left="3600" w:hanging="360"/>
+      </w:pPr>
+    </w:lvl>
+    <w:lvl w:ilvl="5" w:tplc="0409001B" w:tentative="1">
+      <w:start w:val="1"/>
+      <w:numFmt w:val="lowerRoman"/>
+      <w:lvlText w:val="%6."/>
+      <w:lvlJc w:val="right"/>
+      <w:pPr>
+        <w:ind w:left="4320" w:hanging="180"/>
+      </w:pPr>
+    </w:lvl>
+    <w:lvl w:ilvl="6" w:tplc="0409000F" w:tentative="1">
+      <w:start w:val="1"/>
+      <w:numFmt w:val="decimal"/>
+      <w:lvlText w:val="%7."/>
+      <w:lvlJc w:val="left"/>
+      <w:pPr>
+        <w:ind w:left="5040" w:hanging="360"/>
+      </w:pPr>
+    </w:lvl>
+    <w:lvl w:ilvl="7" w:tplc="04090019" w:tentative="1">
+      <w:start w:val="1"/>
+      <w:numFmt w:val="lowerLetter"/>
+      <w:lvlText w:val="%8."/>
+      <w:lvlJc w:val="left"/>
+      <w:pPr>
+        <w:ind w:left="5760" w:hanging="360"/>
+      </w:pPr>
+    </w:lvl>
+    <w:lvl w:ilvl="8" w:tplc="0409001B" w:tentative="1">
+      <w:start w:val="1"/>
+      <w:numFmt w:val="lowerRoman"/>
+      <w:lvlText w:val="%9."/>
+      <w:lvlJc w:val="right"/>
+      <w:pPr>
+        <w:ind w:left="6480" w:hanging="180"/>
+      </w:pPr>
+    </w:lvl>
+  </w:abstractNum>
+  <w:abstractNum w:abstractNumId="1" w15:restartNumberingAfterBreak="0">
     <w:nsid w:val="053039A9"/>
     <w:multiLevelType w:val="hybridMultilevel"/>
     <w:tmpl w:val="954062C2"/>
@@ -1486,7 +1691,300 @@
       </w:pPr>
     </w:lvl>
   </w:abstractNum>
-  <w:abstractNum w:abstractNumId="1" w15:restartNumberingAfterBreak="0">
+  <w:abstractNum w:abstractNumId="2" w15:restartNumberingAfterBreak="0">
+    <w:nsid w:val="0A546123"/>
+    <w:multiLevelType w:val="hybridMultilevel"/>
+    <w:tmpl w:val="86805602"/>
+    <w:lvl w:ilvl="0" w:tplc="9F8EA0A6">
+      <w:start w:val="1"/>
+      <w:numFmt w:val="decimal"/>
+      <w:lvlText w:val="%1."/>
+      <w:lvlJc w:val="left"/>
+      <w:pPr>
+        <w:ind w:left="720" w:hanging="360"/>
+      </w:pPr>
+      <w:rPr>
+        <w:sz w:val="24"/>
+        <w:szCs w:val="24"/>
+      </w:rPr>
+    </w:lvl>
+    <w:lvl w:ilvl="1" w:tplc="04090019" w:tentative="1">
+      <w:start w:val="1"/>
+      <w:numFmt w:val="lowerLetter"/>
+      <w:lvlText w:val="%2."/>
+      <w:lvlJc w:val="left"/>
+      <w:pPr>
+        <w:ind w:left="1440" w:hanging="360"/>
+      </w:pPr>
+    </w:lvl>
+    <w:lvl w:ilvl="2" w:tplc="0409001B" w:tentative="1">
+      <w:start w:val="1"/>
+      <w:numFmt w:val="lowerRoman"/>
+      <w:lvlText w:val="%3."/>
+      <w:lvlJc w:val="right"/>
+      <w:pPr>
+        <w:ind w:left="2160" w:hanging="180"/>
+      </w:pPr>
+    </w:lvl>
+    <w:lvl w:ilvl="3" w:tplc="0409000F" w:tentative="1">
+      <w:start w:val="1"/>
+      <w:numFmt w:val="decimal"/>
+      <w:lvlText w:val="%4."/>
+      <w:lvlJc w:val="left"/>
+      <w:pPr>
+        <w:ind w:left="2880" w:hanging="360"/>
+      </w:pPr>
+    </w:lvl>
+    <w:lvl w:ilvl="4" w:tplc="04090019" w:tentative="1">
+      <w:start w:val="1"/>
+      <w:numFmt w:val="lowerLetter"/>
+      <w:lvlText w:val="%5."/>
+      <w:lvlJc w:val="left"/>
+      <w:pPr>
+        <w:ind w:left="3600" w:hanging="360"/>
+      </w:pPr>
+    </w:lvl>
+    <w:lvl w:ilvl="5" w:tplc="0409001B" w:tentative="1">
+      <w:start w:val="1"/>
+      <w:numFmt w:val="lowerRoman"/>
+      <w:lvlText w:val="%6."/>
+      <w:lvlJc w:val="right"/>
+      <w:pPr>
+        <w:ind w:left="4320" w:hanging="180"/>
+      </w:pPr>
+    </w:lvl>
+    <w:lvl w:ilvl="6" w:tplc="0409000F" w:tentative="1">
+      <w:start w:val="1"/>
+      <w:numFmt w:val="decimal"/>
+      <w:lvlText w:val="%7."/>
+      <w:lvlJc w:val="left"/>
+      <w:pPr>
+        <w:ind w:left="5040" w:hanging="360"/>
+      </w:pPr>
+    </w:lvl>
+    <w:lvl w:ilvl="7" w:tplc="04090019" w:tentative="1">
+      <w:start w:val="1"/>
+      <w:numFmt w:val="lowerLetter"/>
+      <w:lvlText w:val="%8."/>
+      <w:lvlJc w:val="left"/>
+      <w:pPr>
+        <w:ind w:left="5760" w:hanging="360"/>
+      </w:pPr>
+    </w:lvl>
+    <w:lvl w:ilvl="8" w:tplc="0409001B" w:tentative="1">
+      <w:start w:val="1"/>
+      <w:numFmt w:val="lowerRoman"/>
+      <w:lvlText w:val="%9."/>
+      <w:lvlJc w:val="right"/>
+      <w:pPr>
+        <w:ind w:left="6480" w:hanging="180"/>
+      </w:pPr>
+    </w:lvl>
+  </w:abstractNum>
+  <w:abstractNum w:abstractNumId="3" w15:restartNumberingAfterBreak="0">
+    <w:nsid w:val="0C375687"/>
+    <w:multiLevelType w:val="hybridMultilevel"/>
+    <w:tmpl w:val="F6CCBBF0"/>
+    <w:lvl w:ilvl="0" w:tplc="E3BC26F6">
+      <w:numFmt w:val="bullet"/>
+      <w:lvlText w:val="•"/>
+      <w:lvlJc w:val="left"/>
+      <w:pPr>
+        <w:ind w:left="720" w:hanging="360"/>
+      </w:pPr>
+      <w:rPr>
+        <w:rFonts w:ascii="Times New Roman" w:eastAsia="Times New Roman" w:hAnsi="Times New Roman" w:cs="Times New Roman" w:hint="default"/>
+        <w:sz w:val="24"/>
+      </w:rPr>
+    </w:lvl>
+    <w:lvl w:ilvl="1" w:tplc="04090003" w:tentative="1">
+      <w:start w:val="1"/>
+      <w:numFmt w:val="bullet"/>
+      <w:lvlText w:val="o"/>
+      <w:lvlJc w:val="left"/>
+      <w:pPr>
+        <w:ind w:left="1440" w:hanging="360"/>
+      </w:pPr>
+      <w:rPr>
+        <w:rFonts w:ascii="Courier New" w:hAnsi="Courier New" w:hint="default"/>
+      </w:rPr>
+    </w:lvl>
+    <w:lvl w:ilvl="2" w:tplc="04090005" w:tentative="1">
+      <w:start w:val="1"/>
+      <w:numFmt w:val="bullet"/>
+      <w:lvlText w:val=""/>
+      <w:lvlJc w:val="left"/>
+      <w:pPr>
+        <w:ind w:left="2160" w:hanging="360"/>
+      </w:pPr>
+      <w:rPr>
+        <w:rFonts w:ascii="Wingdings" w:hAnsi="Wingdings" w:hint="default"/>
+      </w:rPr>
+    </w:lvl>
+    <w:lvl w:ilvl="3" w:tplc="04090001" w:tentative="1">
+      <w:start w:val="1"/>
+      <w:numFmt w:val="bullet"/>
+      <w:lvlText w:val=""/>
+      <w:lvlJc w:val="left"/>
+      <w:pPr>
+        <w:ind w:left="2880" w:hanging="360"/>
+      </w:pPr>
+      <w:rPr>
+        <w:rFonts w:ascii="Symbol" w:hAnsi="Symbol" w:hint="default"/>
+      </w:rPr>
+    </w:lvl>
+    <w:lvl w:ilvl="4" w:tplc="04090003" w:tentative="1">
+      <w:start w:val="1"/>
+      <w:numFmt w:val="bullet"/>
+      <w:lvlText w:val="o"/>
+      <w:lvlJc w:val="left"/>
+      <w:pPr>
+        <w:ind w:left="3600" w:hanging="360"/>
+      </w:pPr>
+      <w:rPr>
+        <w:rFonts w:ascii="Courier New" w:hAnsi="Courier New" w:hint="default"/>
+      </w:rPr>
+    </w:lvl>
+    <w:lvl w:ilvl="5" w:tplc="04090005" w:tentative="1">
+      <w:start w:val="1"/>
+      <w:numFmt w:val="bullet"/>
+      <w:lvlText w:val=""/>
+      <w:lvlJc w:val="left"/>
+      <w:pPr>
+        <w:ind w:left="4320" w:hanging="360"/>
+      </w:pPr>
+      <w:rPr>
+        <w:rFonts w:ascii="Wingdings" w:hAnsi="Wingdings" w:hint="default"/>
+      </w:rPr>
+    </w:lvl>
+    <w:lvl w:ilvl="6" w:tplc="04090001" w:tentative="1">
+      <w:start w:val="1"/>
+      <w:numFmt w:val="bullet"/>
+      <w:lvlText w:val=""/>
+      <w:lvlJc w:val="left"/>
+      <w:pPr>
+        <w:ind w:left="5040" w:hanging="360"/>
+      </w:pPr>
+      <w:rPr>
+        <w:rFonts w:ascii="Symbol" w:hAnsi="Symbol" w:hint="default"/>
+      </w:rPr>
+    </w:lvl>
+    <w:lvl w:ilvl="7" w:tplc="04090003" w:tentative="1">
+      <w:start w:val="1"/>
+      <w:numFmt w:val="bullet"/>
+      <w:lvlText w:val="o"/>
+      <w:lvlJc w:val="left"/>
+      <w:pPr>
+        <w:ind w:left="5760" w:hanging="360"/>
+      </w:pPr>
+      <w:rPr>
+        <w:rFonts w:ascii="Courier New" w:hAnsi="Courier New" w:hint="default"/>
+      </w:rPr>
+    </w:lvl>
+    <w:lvl w:ilvl="8" w:tplc="04090005" w:tentative="1">
+      <w:start w:val="1"/>
+      <w:numFmt w:val="bullet"/>
+      <w:lvlText w:val=""/>
+      <w:lvlJc w:val="left"/>
+      <w:pPr>
+        <w:ind w:left="6480" w:hanging="360"/>
+      </w:pPr>
+      <w:rPr>
+        <w:rFonts w:ascii="Wingdings" w:hAnsi="Wingdings" w:hint="default"/>
+      </w:rPr>
+    </w:lvl>
+  </w:abstractNum>
+  <w:abstractNum w:abstractNumId="4" w15:restartNumberingAfterBreak="0">
+    <w:nsid w:val="16C06BCA"/>
+    <w:multiLevelType w:val="hybridMultilevel"/>
+    <w:tmpl w:val="E7126198"/>
+    <w:lvl w:ilvl="0" w:tplc="9F8EA0A6">
+      <w:start w:val="1"/>
+      <w:numFmt w:val="decimal"/>
+      <w:lvlText w:val="%1."/>
+      <w:lvlJc w:val="left"/>
+      <w:pPr>
+        <w:ind w:left="720" w:hanging="360"/>
+      </w:pPr>
+      <w:rPr>
+        <w:sz w:val="24"/>
+        <w:szCs w:val="24"/>
+      </w:rPr>
+    </w:lvl>
+    <w:lvl w:ilvl="1" w:tplc="04090019" w:tentative="1">
+      <w:start w:val="1"/>
+      <w:numFmt w:val="lowerLetter"/>
+      <w:lvlText w:val="%2."/>
+      <w:lvlJc w:val="left"/>
+      <w:pPr>
+        <w:ind w:left="1440" w:hanging="360"/>
+      </w:pPr>
+    </w:lvl>
+    <w:lvl w:ilvl="2" w:tplc="0409001B" w:tentative="1">
+      <w:start w:val="1"/>
+      <w:numFmt w:val="lowerRoman"/>
+      <w:lvlText w:val="%3."/>
+      <w:lvlJc w:val="right"/>
+      <w:pPr>
+        <w:ind w:left="2160" w:hanging="180"/>
+      </w:pPr>
+    </w:lvl>
+    <w:lvl w:ilvl="3" w:tplc="0409000F" w:tentative="1">
+      <w:start w:val="1"/>
+      <w:numFmt w:val="decimal"/>
+      <w:lvlText w:val="%4."/>
+      <w:lvlJc w:val="left"/>
+      <w:pPr>
+        <w:ind w:left="2880" w:hanging="360"/>
+      </w:pPr>
+    </w:lvl>
+    <w:lvl w:ilvl="4" w:tplc="04090019" w:tentative="1">
+      <w:start w:val="1"/>
+      <w:numFmt w:val="lowerLetter"/>
+      <w:lvlText w:val="%5."/>
+      <w:lvlJc w:val="left"/>
+      <w:pPr>
+        <w:ind w:left="3600" w:hanging="360"/>
+      </w:pPr>
+    </w:lvl>
+    <w:lvl w:ilvl="5" w:tplc="0409001B" w:tentative="1">
+      <w:start w:val="1"/>
+      <w:numFmt w:val="lowerRoman"/>
+      <w:lvlText w:val="%6."/>
+      <w:lvlJc w:val="right"/>
+      <w:pPr>
+        <w:ind w:left="4320" w:hanging="180"/>
+      </w:pPr>
+    </w:lvl>
+    <w:lvl w:ilvl="6" w:tplc="0409000F" w:tentative="1">
+      <w:start w:val="1"/>
+      <w:numFmt w:val="decimal"/>
+      <w:lvlText w:val="%7."/>
+      <w:lvlJc w:val="left"/>
+      <w:pPr>
+        <w:ind w:left="5040" w:hanging="360"/>
+      </w:pPr>
+    </w:lvl>
+    <w:lvl w:ilvl="7" w:tplc="04090019" w:tentative="1">
+      <w:start w:val="1"/>
+      <w:numFmt w:val="lowerLetter"/>
+      <w:lvlText w:val="%8."/>
+      <w:lvlJc w:val="left"/>
+      <w:pPr>
+        <w:ind w:left="5760" w:hanging="360"/>
+      </w:pPr>
+    </w:lvl>
+    <w:lvl w:ilvl="8" w:tplc="0409001B" w:tentative="1">
+      <w:start w:val="1"/>
+      <w:numFmt w:val="lowerRoman"/>
+      <w:lvlText w:val="%9."/>
+      <w:lvlJc w:val="right"/>
+      <w:pPr>
+        <w:ind w:left="6480" w:hanging="180"/>
+      </w:pPr>
+    </w:lvl>
+  </w:abstractNum>
+  <w:abstractNum w:abstractNumId="5" w15:restartNumberingAfterBreak="0">
     <w:nsid w:val="1AA67BB4"/>
     <w:multiLevelType w:val="hybridMultilevel"/>
     <w:tmpl w:val="E9C48B70"/>
@@ -1599,7 +2097,233 @@
       </w:rPr>
     </w:lvl>
   </w:abstractNum>
-  <w:abstractNum w:abstractNumId="2" w15:restartNumberingAfterBreak="0">
+  <w:abstractNum w:abstractNumId="6" w15:restartNumberingAfterBreak="0">
+    <w:nsid w:val="2A1C3E1A"/>
+    <w:multiLevelType w:val="hybridMultilevel"/>
+    <w:tmpl w:val="A03471F6"/>
+    <w:lvl w:ilvl="0" w:tplc="EEE6ACC6">
+      <w:numFmt w:val="bullet"/>
+      <w:lvlText w:val="•"/>
+      <w:lvlJc w:val="left"/>
+      <w:pPr>
+        <w:ind w:left="720" w:hanging="360"/>
+      </w:pPr>
+      <w:rPr>
+        <w:rFonts w:ascii="Times New Roman" w:eastAsia="Times New Roman" w:hAnsi="Times New Roman" w:cs="Times New Roman" w:hint="default"/>
+        <w:sz w:val="24"/>
+      </w:rPr>
+    </w:lvl>
+    <w:lvl w:ilvl="1" w:tplc="04090003" w:tentative="1">
+      <w:start w:val="1"/>
+      <w:numFmt w:val="bullet"/>
+      <w:lvlText w:val="o"/>
+      <w:lvlJc w:val="left"/>
+      <w:pPr>
+        <w:ind w:left="1440" w:hanging="360"/>
+      </w:pPr>
+      <w:rPr>
+        <w:rFonts w:ascii="Courier New" w:hAnsi="Courier New" w:hint="default"/>
+      </w:rPr>
+    </w:lvl>
+    <w:lvl w:ilvl="2" w:tplc="04090005" w:tentative="1">
+      <w:start w:val="1"/>
+      <w:numFmt w:val="bullet"/>
+      <w:lvlText w:val=""/>
+      <w:lvlJc w:val="left"/>
+      <w:pPr>
+        <w:ind w:left="2160" w:hanging="360"/>
+      </w:pPr>
+      <w:rPr>
+        <w:rFonts w:ascii="Wingdings" w:hAnsi="Wingdings" w:hint="default"/>
+      </w:rPr>
+    </w:lvl>
+    <w:lvl w:ilvl="3" w:tplc="04090001" w:tentative="1">
+      <w:start w:val="1"/>
+      <w:numFmt w:val="bullet"/>
+      <w:lvlText w:val=""/>
+      <w:lvlJc w:val="left"/>
+      <w:pPr>
+        <w:ind w:left="2880" w:hanging="360"/>
+      </w:pPr>
+      <w:rPr>
+        <w:rFonts w:ascii="Symbol" w:hAnsi="Symbol" w:hint="default"/>
+      </w:rPr>
+    </w:lvl>
+    <w:lvl w:ilvl="4" w:tplc="04090003" w:tentative="1">
+      <w:start w:val="1"/>
+      <w:numFmt w:val="bullet"/>
+      <w:lvlText w:val="o"/>
+      <w:lvlJc w:val="left"/>
+      <w:pPr>
+        <w:ind w:left="3600" w:hanging="360"/>
+      </w:pPr>
+      <w:rPr>
+        <w:rFonts w:ascii="Courier New" w:hAnsi="Courier New" w:hint="default"/>
+      </w:rPr>
+    </w:lvl>
+    <w:lvl w:ilvl="5" w:tplc="04090005" w:tentative="1">
+      <w:start w:val="1"/>
+      <w:numFmt w:val="bullet"/>
+      <w:lvlText w:val=""/>
+      <w:lvlJc w:val="left"/>
+      <w:pPr>
+        <w:ind w:left="4320" w:hanging="360"/>
+      </w:pPr>
+      <w:rPr>
+        <w:rFonts w:ascii="Wingdings" w:hAnsi="Wingdings" w:hint="default"/>
+      </w:rPr>
+    </w:lvl>
+    <w:lvl w:ilvl="6" w:tplc="04090001" w:tentative="1">
+      <w:start w:val="1"/>
+      <w:numFmt w:val="bullet"/>
+      <w:lvlText w:val=""/>
+      <w:lvlJc w:val="left"/>
+      <w:pPr>
+        <w:ind w:left="5040" w:hanging="360"/>
+      </w:pPr>
+      <w:rPr>
+        <w:rFonts w:ascii="Symbol" w:hAnsi="Symbol" w:hint="default"/>
+      </w:rPr>
+    </w:lvl>
+    <w:lvl w:ilvl="7" w:tplc="04090003" w:tentative="1">
+      <w:start w:val="1"/>
+      <w:numFmt w:val="bullet"/>
+      <w:lvlText w:val="o"/>
+      <w:lvlJc w:val="left"/>
+      <w:pPr>
+        <w:ind w:left="5760" w:hanging="360"/>
+      </w:pPr>
+      <w:rPr>
+        <w:rFonts w:ascii="Courier New" w:hAnsi="Courier New" w:hint="default"/>
+      </w:rPr>
+    </w:lvl>
+    <w:lvl w:ilvl="8" w:tplc="04090005" w:tentative="1">
+      <w:start w:val="1"/>
+      <w:numFmt w:val="bullet"/>
+      <w:lvlText w:val=""/>
+      <w:lvlJc w:val="left"/>
+      <w:pPr>
+        <w:ind w:left="6480" w:hanging="360"/>
+      </w:pPr>
+      <w:rPr>
+        <w:rFonts w:ascii="Wingdings" w:hAnsi="Wingdings" w:hint="default"/>
+      </w:rPr>
+    </w:lvl>
+  </w:abstractNum>
+  <w:abstractNum w:abstractNumId="7" w15:restartNumberingAfterBreak="0">
+    <w:nsid w:val="30BB3558"/>
+    <w:multiLevelType w:val="hybridMultilevel"/>
+    <w:tmpl w:val="F5F43CEC"/>
+    <w:lvl w:ilvl="0" w:tplc="D5D6F404">
+      <w:numFmt w:val="bullet"/>
+      <w:lvlText w:val="•"/>
+      <w:lvlJc w:val="left"/>
+      <w:pPr>
+        <w:ind w:left="720" w:hanging="360"/>
+      </w:pPr>
+      <w:rPr>
+        <w:rFonts w:ascii="Times New Roman" w:eastAsia="Times New Roman" w:hAnsi="Times New Roman" w:cs="Times New Roman" w:hint="default"/>
+        <w:sz w:val="24"/>
+      </w:rPr>
+    </w:lvl>
+    <w:lvl w:ilvl="1" w:tplc="04090003" w:tentative="1">
+      <w:start w:val="1"/>
+      <w:numFmt w:val="bullet"/>
+      <w:lvlText w:val="o"/>
+      <w:lvlJc w:val="left"/>
+      <w:pPr>
+        <w:ind w:left="1440" w:hanging="360"/>
+      </w:pPr>
+      <w:rPr>
+        <w:rFonts w:ascii="Courier New" w:hAnsi="Courier New" w:hint="default"/>
+      </w:rPr>
+    </w:lvl>
+    <w:lvl w:ilvl="2" w:tplc="04090005" w:tentative="1">
+      <w:start w:val="1"/>
+      <w:numFmt w:val="bullet"/>
+      <w:lvlText w:val=""/>
+      <w:lvlJc w:val="left"/>
+      <w:pPr>
+        <w:ind w:left="2160" w:hanging="360"/>
+      </w:pPr>
+      <w:rPr>
+        <w:rFonts w:ascii="Wingdings" w:hAnsi="Wingdings" w:hint="default"/>
+      </w:rPr>
+    </w:lvl>
+    <w:lvl w:ilvl="3" w:tplc="04090001" w:tentative="1">
+      <w:start w:val="1"/>
+      <w:numFmt w:val="bullet"/>
+      <w:lvlText w:val=""/>
+      <w:lvlJc w:val="left"/>
+      <w:pPr>
+        <w:ind w:left="2880" w:hanging="360"/>
+      </w:pPr>
+      <w:rPr>
+        <w:rFonts w:ascii="Symbol" w:hAnsi="Symbol" w:hint="default"/>
+      </w:rPr>
+    </w:lvl>
+    <w:lvl w:ilvl="4" w:tplc="04090003" w:tentative="1">
+      <w:start w:val="1"/>
+      <w:numFmt w:val="bullet"/>
+      <w:lvlText w:val="o"/>
+      <w:lvlJc w:val="left"/>
+      <w:pPr>
+        <w:ind w:left="3600" w:hanging="360"/>
+      </w:pPr>
+      <w:rPr>
+        <w:rFonts w:ascii="Courier New" w:hAnsi="Courier New" w:hint="default"/>
+      </w:rPr>
+    </w:lvl>
+    <w:lvl w:ilvl="5" w:tplc="04090005" w:tentative="1">
+      <w:start w:val="1"/>
+      <w:numFmt w:val="bullet"/>
+      <w:lvlText w:val=""/>
+      <w:lvlJc w:val="left"/>
+      <w:pPr>
+        <w:ind w:left="4320" w:hanging="360"/>
+      </w:pPr>
+      <w:rPr>
+        <w:rFonts w:ascii="Wingdings" w:hAnsi="Wingdings" w:hint="default"/>
+      </w:rPr>
+    </w:lvl>
+    <w:lvl w:ilvl="6" w:tplc="04090001" w:tentative="1">
+      <w:start w:val="1"/>
+      <w:numFmt w:val="bullet"/>
+      <w:lvlText w:val=""/>
+      <w:lvlJc w:val="left"/>
+      <w:pPr>
+        <w:ind w:left="5040" w:hanging="360"/>
+      </w:pPr>
+      <w:rPr>
+        <w:rFonts w:ascii="Symbol" w:hAnsi="Symbol" w:hint="default"/>
+      </w:rPr>
+    </w:lvl>
+    <w:lvl w:ilvl="7" w:tplc="04090003" w:tentative="1">
+      <w:start w:val="1"/>
+      <w:numFmt w:val="bullet"/>
+      <w:lvlText w:val="o"/>
+      <w:lvlJc w:val="left"/>
+      <w:pPr>
+        <w:ind w:left="5760" w:hanging="360"/>
+      </w:pPr>
+      <w:rPr>
+        <w:rFonts w:ascii="Courier New" w:hAnsi="Courier New" w:hint="default"/>
+      </w:rPr>
+    </w:lvl>
+    <w:lvl w:ilvl="8" w:tplc="04090005" w:tentative="1">
+      <w:start w:val="1"/>
+      <w:numFmt w:val="bullet"/>
+      <w:lvlText w:val=""/>
+      <w:lvlJc w:val="left"/>
+      <w:pPr>
+        <w:ind w:left="6480" w:hanging="360"/>
+      </w:pPr>
+      <w:rPr>
+        <w:rFonts w:ascii="Wingdings" w:hAnsi="Wingdings" w:hint="default"/>
+      </w:rPr>
+    </w:lvl>
+  </w:abstractNum>
+  <w:abstractNum w:abstractNumId="8" w15:restartNumberingAfterBreak="0">
     <w:nsid w:val="3D8E2FC8"/>
     <w:multiLevelType w:val="hybridMultilevel"/>
     <w:tmpl w:val="95C67436"/>
@@ -1712,7 +2436,7 @@
       </w:rPr>
     </w:lvl>
   </w:abstractNum>
-  <w:abstractNum w:abstractNumId="3" w15:restartNumberingAfterBreak="0">
+  <w:abstractNum w:abstractNumId="9" w15:restartNumberingAfterBreak="0">
     <w:nsid w:val="53F059B7"/>
     <w:multiLevelType w:val="hybridMultilevel"/>
     <w:tmpl w:val="94D2DD0E"/>
@@ -1803,7 +2527,7 @@
       </w:pPr>
     </w:lvl>
   </w:abstractNum>
-  <w:abstractNum w:abstractNumId="4" w15:restartNumberingAfterBreak="0">
+  <w:abstractNum w:abstractNumId="10" w15:restartNumberingAfterBreak="0">
     <w:nsid w:val="5AA951CF"/>
     <w:multiLevelType w:val="hybridMultilevel"/>
     <w:tmpl w:val="E66EA5E0"/>
@@ -1892,7 +2616,7 @@
       </w:pPr>
     </w:lvl>
   </w:abstractNum>
-  <w:abstractNum w:abstractNumId="5" w15:restartNumberingAfterBreak="0">
+  <w:abstractNum w:abstractNumId="11" w15:restartNumberingAfterBreak="0">
     <w:nsid w:val="644C04BF"/>
     <w:multiLevelType w:val="hybridMultilevel"/>
     <w:tmpl w:val="82B27966"/>
@@ -1983,7 +2707,7 @@
       </w:pPr>
     </w:lvl>
   </w:abstractNum>
-  <w:abstractNum w:abstractNumId="6" w15:restartNumberingAfterBreak="0">
+  <w:abstractNum w:abstractNumId="12" w15:restartNumberingAfterBreak="0">
     <w:nsid w:val="710B08D2"/>
     <w:multiLevelType w:val="hybridMultilevel"/>
     <w:tmpl w:val="EE9425F0"/>
@@ -2073,25 +2797,43 @@
     </w:lvl>
   </w:abstractNum>
   <w:num w:numId="1" w16cid:durableId="2094159518">
+    <w:abstractNumId w:val="11"/>
+  </w:num>
+  <w:num w:numId="2" w16cid:durableId="1180897690">
+    <w:abstractNumId w:val="1"/>
+  </w:num>
+  <w:num w:numId="3" w16cid:durableId="74859141">
+    <w:abstractNumId w:val="8"/>
+  </w:num>
+  <w:num w:numId="4" w16cid:durableId="1368216575">
     <w:abstractNumId w:val="5"/>
   </w:num>
-  <w:num w:numId="2" w16cid:durableId="1180897690">
+  <w:num w:numId="5" w16cid:durableId="37363506">
+    <w:abstractNumId w:val="9"/>
+  </w:num>
+  <w:num w:numId="6" w16cid:durableId="1562253075">
+    <w:abstractNumId w:val="12"/>
+  </w:num>
+  <w:num w:numId="7" w16cid:durableId="789936826">
+    <w:abstractNumId w:val="10"/>
+  </w:num>
+  <w:num w:numId="8" w16cid:durableId="1845583044">
+    <w:abstractNumId w:val="4"/>
+  </w:num>
+  <w:num w:numId="9" w16cid:durableId="1687054442">
+    <w:abstractNumId w:val="3"/>
+  </w:num>
+  <w:num w:numId="10" w16cid:durableId="1701735040">
     <w:abstractNumId w:val="0"/>
   </w:num>
-  <w:num w:numId="3" w16cid:durableId="74859141">
+  <w:num w:numId="11" w16cid:durableId="905144680">
+    <w:abstractNumId w:val="6"/>
+  </w:num>
+  <w:num w:numId="12" w16cid:durableId="806623700">
     <w:abstractNumId w:val="2"/>
   </w:num>
-  <w:num w:numId="4" w16cid:durableId="1368216575">
-    <w:abstractNumId w:val="1"/>
-  </w:num>
-  <w:num w:numId="5" w16cid:durableId="37363506">
-    <w:abstractNumId w:val="3"/>
-  </w:num>
-  <w:num w:numId="6" w16cid:durableId="1562253075">
-    <w:abstractNumId w:val="6"/>
-  </w:num>
-  <w:num w:numId="7" w16cid:durableId="789936826">
-    <w:abstractNumId w:val="4"/>
+  <w:num w:numId="13" w16cid:durableId="1103189473">
+    <w:abstractNumId w:val="7"/>
   </w:num>
 </w:numbering>
 </file>

</xml_diff>